<commit_message>
vault backup: 2026-05-11 18:23:26
</commit_message>
<xml_diff>
--- a/Учеба 4 семестр/Английский язык/Сокращенные монологи/monologue 2(сокр).docx
+++ b/Учеба 4 семестр/Английский язык/Сокращенные монологи/monologue 2(сокр).docx
@@ -17,14 +17,7 @@
           <w:rFonts w:cs="Times New Roman"/>
           <w:lang w:val="en-US"/>
         </w:rPr>
-        <w:t>1.</w:t>
-      </w:r>
-      <w:r>
-        <w:rPr>
-          <w:rFonts w:cs="Times New Roman"/>
-          <w:lang w:val="en-US"/>
-        </w:rPr>
-        <w:t xml:space="preserve">“Any modern advanced technology is does not different from magic”. </w:t>
+        <w:t xml:space="preserve">1.“Any modern advanced technology is does not different from magic”. </w:t>
       </w:r>
     </w:p>
     <w:p>
@@ -97,7 +90,19 @@
         <w:rPr>
           <w:lang w:val="en-US"/>
         </w:rPr>
-        <w:t>, I will explain the history of computing</w:t>
+        <w:t xml:space="preserve">, I will </w:t>
+      </w:r>
+      <w:r>
+        <w:rPr>
+          <w:lang w:val="en-US"/>
+        </w:rPr>
+        <w:t>talk about</w:t>
+      </w:r>
+      <w:r>
+        <w:rPr>
+          <w:lang w:val="en-US"/>
+        </w:rPr>
+        <w:t xml:space="preserve"> the history of computing</w:t>
       </w:r>
       <w:r>
         <w:rPr>
@@ -206,6 +211,11 @@
       </w:r>
     </w:p>
     <w:p>
+      <w:pPr>
+        <w:rPr>
+          <w:lang w:val="en-US"/>
+        </w:rPr>
+      </w:pPr>
       <w:r>
         <w:rPr>
           <w:lang w:val="en-US"/>
@@ -220,7 +230,13 @@
         <w:t>Before working with a computer, users usually turn on a hardware device and install a program on the computer.</w:t>
       </w:r>
     </w:p>
-    <w:p/>
+    <w:p>
+      <w:pPr>
+        <w:rPr>
+          <w:lang w:val="en-US"/>
+        </w:rPr>
+      </w:pPr>
+    </w:p>
     <w:p>
       <w:pPr>
         <w:rPr>
@@ -2472,6 +2488,7 @@
   <w:style w:type="character" w:default="1" w:styleId="a0">
     <w:name w:val="Default Paragraph Font"/>
     <w:uiPriority w:val="1"/>
+    <w:semiHidden/>
     <w:unhideWhenUsed/>
   </w:style>
   <w:style w:type="table" w:default="1" w:styleId="a1">

</xml_diff>

<commit_message>
vault backup: 2026-05-11 19:04:28
</commit_message>
<xml_diff>
--- a/Учеба 4 семестр/Английский язык/Сокращенные монологи/monologue 2(сокр).docx
+++ b/Учеба 4 семестр/Английский язык/Сокращенные монологи/monologue 2(сокр).docx
@@ -571,38 +571,6 @@
           <w:lang w:val="en-US"/>
         </w:rPr>
         <w:lastRenderedPageBreak/>
-        <w:t>5.</w:t>
-      </w:r>
-      <w:r>
-        <w:rPr>
-          <w:lang w:val="en-US"/>
-        </w:rPr>
-        <w:tab/>
-        <w:t xml:space="preserve">In </w:t>
-      </w:r>
-      <w:r>
-        <w:rPr>
-          <w:lang w:val="en-US"/>
-        </w:rPr>
-        <w:t>addition,</w:t>
-      </w:r>
-      <w:r>
-        <w:rPr>
-          <w:lang w:val="en-US"/>
-        </w:rPr>
-        <w:t xml:space="preserve"> computers help people accomplish many everyday tasks.</w:t>
-      </w:r>
-    </w:p>
-    <w:p>
-      <w:pPr>
-        <w:rPr>
-          <w:lang w:val="en-US"/>
-        </w:rPr>
-      </w:pPr>
-      <w:r>
-        <w:rPr>
-          <w:lang w:val="en-US"/>
-        </w:rPr>
         <w:t>4</w:t>
       </w:r>
     </w:p>
@@ -721,7 +689,7 @@
         <w:rPr>
           <w:lang w:val="en-US"/>
         </w:rPr>
-        <w:t xml:space="preserve"> much faster than </w:t>
+        <w:t xml:space="preserve"> faster than </w:t>
       </w:r>
       <w:r>
         <w:rPr>
@@ -782,7 +750,13 @@
           <w:lang w:val="en-US"/>
         </w:rPr>
         <w:tab/>
-        <w:t xml:space="preserve">Unlike default computers, they use parallel processing instead of the serial processing. </w:t>
+        <w:t>Unlike default computers, they use parallel processing</w:t>
+      </w:r>
+      <w:r>
+        <w:rPr>
+          <w:lang w:val="en-US"/>
+        </w:rPr>
+        <w:t>.</w:t>
       </w:r>
     </w:p>
     <w:p>
@@ -1417,7 +1391,7 @@
       <w:lvlText w:val="%1."/>
       <w:lvlJc w:val="left"/>
       <w:pPr>
-        <w:ind w:left="720" w:hanging="360"/>
+        <w:ind w:left="1068" w:hanging="360"/>
       </w:pPr>
       <w:rPr>
         <w:rFonts w:hint="default"/>
@@ -1429,7 +1403,7 @@
       <w:lvlText w:val="%2."/>
       <w:lvlJc w:val="left"/>
       <w:pPr>
-        <w:ind w:left="1440" w:hanging="360"/>
+        <w:ind w:left="1788" w:hanging="360"/>
       </w:pPr>
     </w:lvl>
     <w:lvl w:ilvl="2" w:tplc="0419001B" w:tentative="1">
@@ -1438,7 +1412,7 @@
       <w:lvlText w:val="%3."/>
       <w:lvlJc w:val="right"/>
       <w:pPr>
-        <w:ind w:left="2160" w:hanging="180"/>
+        <w:ind w:left="2508" w:hanging="180"/>
       </w:pPr>
     </w:lvl>
     <w:lvl w:ilvl="3" w:tplc="0419000F" w:tentative="1">
@@ -1447,7 +1421,7 @@
       <w:lvlText w:val="%4."/>
       <w:lvlJc w:val="left"/>
       <w:pPr>
-        <w:ind w:left="2880" w:hanging="360"/>
+        <w:ind w:left="3228" w:hanging="360"/>
       </w:pPr>
     </w:lvl>
     <w:lvl w:ilvl="4" w:tplc="04190019" w:tentative="1">
@@ -1456,7 +1430,7 @@
       <w:lvlText w:val="%5."/>
       <w:lvlJc w:val="left"/>
       <w:pPr>
-        <w:ind w:left="3600" w:hanging="360"/>
+        <w:ind w:left="3948" w:hanging="360"/>
       </w:pPr>
     </w:lvl>
     <w:lvl w:ilvl="5" w:tplc="0419001B" w:tentative="1">
@@ -1465,7 +1439,7 @@
       <w:lvlText w:val="%6."/>
       <w:lvlJc w:val="right"/>
       <w:pPr>
-        <w:ind w:left="4320" w:hanging="180"/>
+        <w:ind w:left="4668" w:hanging="180"/>
       </w:pPr>
     </w:lvl>
     <w:lvl w:ilvl="6" w:tplc="0419000F" w:tentative="1">
@@ -1474,7 +1448,7 @@
       <w:lvlText w:val="%7."/>
       <w:lvlJc w:val="left"/>
       <w:pPr>
-        <w:ind w:left="5040" w:hanging="360"/>
+        <w:ind w:left="5388" w:hanging="360"/>
       </w:pPr>
     </w:lvl>
     <w:lvl w:ilvl="7" w:tplc="04190019" w:tentative="1">
@@ -1483,7 +1457,7 @@
       <w:lvlText w:val="%8."/>
       <w:lvlJc w:val="left"/>
       <w:pPr>
-        <w:ind w:left="5760" w:hanging="360"/>
+        <w:ind w:left="6108" w:hanging="360"/>
       </w:pPr>
     </w:lvl>
     <w:lvl w:ilvl="8" w:tplc="0419001B" w:tentative="1">
@@ -1492,7 +1466,7 @@
       <w:lvlText w:val="%9."/>
       <w:lvlJc w:val="right"/>
       <w:pPr>
-        <w:ind w:left="6480" w:hanging="180"/>
+        <w:ind w:left="6828" w:hanging="180"/>
       </w:pPr>
     </w:lvl>
   </w:abstractNum>
@@ -3098,4 +3072,16 @@
     </a:ext>
   </a:extLst>
 </a:theme>
+</file>
+
+<file path=customXml/item1.xml><?xml version="1.0" encoding="utf-8"?>
+<b:Sources xmlns:b="http://schemas.openxmlformats.org/officeDocument/2006/bibliography" xmlns="http://schemas.openxmlformats.org/officeDocument/2006/bibliography" SelectedStyle="\APASixthEditionOfficeOnline.xsl" StyleName="APA" Version="6"/>
+</file>
+
+<file path=customXml/itemProps1.xml><?xml version="1.0" encoding="utf-8"?>
+<ds:datastoreItem xmlns:ds="http://schemas.openxmlformats.org/officeDocument/2006/customXml" ds:itemID="{F7936DAD-0262-4FF0-8676-79C97D1C4D7E}">
+  <ds:schemaRefs>
+    <ds:schemaRef ds:uri="http://schemas.openxmlformats.org/officeDocument/2006/bibliography"/>
+  </ds:schemaRefs>
+</ds:datastoreItem>
 </file>
</xml_diff>